<commit_message>
Fixed linux compilation and build Updated packages and version Initial XDATCAR Reader support
</commit_message>
<xml_diff>
--- a/doc/Setup-instructions-linux.docx
+++ b/doc/Setup-instructions-linux.docx
@@ -23,7 +23,15 @@
         <w:t xml:space="preserve">The version I’m sending you </w:t>
       </w:r>
       <w:r>
-        <w:t>should work in development mode except the Symmetry part that relies on external and compiled code. Also, movie generation in formats that are not WEBm require an external executable.</w:t>
+        <w:t xml:space="preserve">should work in development mode except the Symmetry part that relies on external and compiled code. Also, movie generation in formats that are not </w:t>
+      </w:r>
+      <w:proofErr w:type="spellStart"/>
+      <w:r>
+        <w:t>WEBm</w:t>
+      </w:r>
+      <w:proofErr w:type="spellEnd"/>
+      <w:r>
+        <w:t xml:space="preserve"> require an external executable.</w:t>
       </w:r>
     </w:p>
     <w:p>
@@ -48,7 +56,15 @@
     </w:p>
     <w:p>
       <w:r>
-        <w:t>Here are the initial steps. I use your home directory (the “~”) as the directory where you unpack the tar file.</w:t>
+        <w:t xml:space="preserve">Here are the </w:t>
+      </w:r>
+      <w:proofErr w:type="gramStart"/>
+      <w:r>
+        <w:t>initial</w:t>
+      </w:r>
+      <w:proofErr w:type="gramEnd"/>
+      <w:r>
+        <w:t xml:space="preserve"> steps. I use your home directory (the “~”) as the directory where you unpack the tar file.</w:t>
       </w:r>
     </w:p>
     <w:p>
@@ -60,7 +76,15 @@
         </w:numPr>
       </w:pPr>
       <w:r>
-        <w:t>Unpack the tar file I sent you by SwissTransfer in ~/</w:t>
+        <w:t xml:space="preserve">Unpack the tar file I sent you by </w:t>
+      </w:r>
+      <w:proofErr w:type="spellStart"/>
+      <w:r>
+        <w:t>SwissTransfer</w:t>
+      </w:r>
+      <w:proofErr w:type="spellEnd"/>
+      <w:r>
+        <w:t xml:space="preserve"> in ~/</w:t>
       </w:r>
     </w:p>
     <w:p>
@@ -72,14 +96,34 @@
         </w:numPr>
       </w:pPr>
       <w:r>
-        <w:t xml:space="preserve">Install nodejs from </w:t>
+        <w:t xml:space="preserve">Install </w:t>
+      </w:r>
+      <w:proofErr w:type="spellStart"/>
+      <w:r>
+        <w:t>nodejs</w:t>
+      </w:r>
+      <w:proofErr w:type="spellEnd"/>
+      <w:r>
+        <w:t xml:space="preserve"> from </w:t>
       </w:r>
       <w:hyperlink r:id="rId5" w:history="1">
         <w:r>
           <w:rPr>
             <w:rStyle w:val="Hyperlink"/>
           </w:rPr>
-          <w:t>https://nodejs.org/en/download/prebuilt-binaries/current</w:t>
+          <w:t>https://nodejs.org/en/download/prebu</w:t>
+        </w:r>
+        <w:r>
+          <w:rPr>
+            <w:rStyle w:val="Hyperlink"/>
+          </w:rPr>
+          <w:t>i</w:t>
+        </w:r>
+        <w:r>
+          <w:rPr>
+            <w:rStyle w:val="Hyperlink"/>
+          </w:rPr>
+          <w:t>lt-binaries/current</w:t>
         </w:r>
       </w:hyperlink>
       <w:r>
@@ -95,7 +139,15 @@
         </w:numPr>
       </w:pPr>
       <w:r>
-        <w:t xml:space="preserve">Verify node works: node –version </w:t>
+        <w:t>Verify node works: node –</w:t>
+      </w:r>
+      <w:proofErr w:type="gramStart"/>
+      <w:r>
+        <w:t>version</w:t>
+      </w:r>
+      <w:proofErr w:type="gramEnd"/>
+      <w:r>
+        <w:t xml:space="preserve"> </w:t>
       </w:r>
     </w:p>
     <w:p>
@@ -107,10 +159,34 @@
         </w:numPr>
       </w:pPr>
       <w:r>
-        <w:t>Run: node -e "console.log(require('os').platform())"</w:t>
-      </w:r>
-      <w:r>
-        <w:t xml:space="preserve"> and check the result is “linux”</w:t>
+        <w:t>Run: node -e "console.log(require('</w:t>
+      </w:r>
+      <w:proofErr w:type="spellStart"/>
+      <w:r>
+        <w:t>os</w:t>
+      </w:r>
+      <w:proofErr w:type="spellEnd"/>
+      <w:r>
+        <w:t>'</w:t>
+      </w:r>
+      <w:proofErr w:type="gramStart"/>
+      <w:r>
+        <w:t>).platform</w:t>
+      </w:r>
+      <w:proofErr w:type="gramEnd"/>
+      <w:r>
+        <w:t>())"</w:t>
+      </w:r>
+      <w:r>
+        <w:t xml:space="preserve"> and check the result is “</w:t>
+      </w:r>
+      <w:proofErr w:type="spellStart"/>
+      <w:r>
+        <w:t>linux</w:t>
+      </w:r>
+      <w:proofErr w:type="spellEnd"/>
+      <w:r>
+        <w:t>”</w:t>
       </w:r>
     </w:p>
     <w:p>
@@ -122,8 +198,29 @@
         </w:numPr>
       </w:pPr>
       <w:r>
-        <w:t>Verify npm works: npm –version</w:t>
-      </w:r>
+        <w:t xml:space="preserve">Verify </w:t>
+      </w:r>
+      <w:proofErr w:type="spellStart"/>
+      <w:r>
+        <w:t>npm</w:t>
+      </w:r>
+      <w:proofErr w:type="spellEnd"/>
+      <w:r>
+        <w:t xml:space="preserve"> works: </w:t>
+      </w:r>
+      <w:proofErr w:type="spellStart"/>
+      <w:r>
+        <w:t>npm</w:t>
+      </w:r>
+      <w:proofErr w:type="spellEnd"/>
+      <w:r>
+        <w:t xml:space="preserve"> –</w:t>
+      </w:r>
+      <w:proofErr w:type="gramStart"/>
+      <w:r>
+        <w:t>version</w:t>
+      </w:r>
+      <w:proofErr w:type="gramEnd"/>
     </w:p>
     <w:p>
       <w:pPr>
@@ -134,8 +231,21 @@
         </w:numPr>
       </w:pPr>
       <w:r>
-        <w:t>Then cd ~/STMng and run npm install This creates the directory node_modules</w:t>
-      </w:r>
+        <w:t xml:space="preserve">Then cd ~/STMng and run </w:t>
+      </w:r>
+      <w:proofErr w:type="spellStart"/>
+      <w:r>
+        <w:t>npm</w:t>
+      </w:r>
+      <w:proofErr w:type="spellEnd"/>
+      <w:r>
+        <w:t xml:space="preserve"> install This creates the directory </w:t>
+      </w:r>
+      <w:proofErr w:type="spellStart"/>
+      <w:r>
+        <w:t>node_modules</w:t>
+      </w:r>
+      <w:proofErr w:type="spellEnd"/>
     </w:p>
     <w:p>
       <w:pPr>
@@ -152,8 +262,23 @@
         <w:t xml:space="preserve"> (always from ~/STMng)</w:t>
       </w:r>
       <w:r>
-        <w:t>: npx vite</w:t>
-      </w:r>
+        <w:t xml:space="preserve">: </w:t>
+      </w:r>
+      <w:proofErr w:type="spellStart"/>
+      <w:r>
+        <w:t>npx</w:t>
+      </w:r>
+      <w:proofErr w:type="spellEnd"/>
+      <w:r>
+        <w:t xml:space="preserve"> </w:t>
+      </w:r>
+      <w:proofErr w:type="spellStart"/>
+      <w:proofErr w:type="gramStart"/>
+      <w:r>
+        <w:t>vite</w:t>
+      </w:r>
+      <w:proofErr w:type="spellEnd"/>
+      <w:proofErr w:type="gramEnd"/>
     </w:p>
     <w:p>
       <w:pPr>
@@ -184,7 +309,15 @@
     </w:p>
     <w:p>
       <w:r>
-        <w:t>I sent you four files (directories are relative to ~/STMng):</w:t>
+        <w:t xml:space="preserve">I sent you four files (directories are </w:t>
+      </w:r>
+      <w:proofErr w:type="gramStart"/>
+      <w:r>
+        <w:t>relative</w:t>
+      </w:r>
+      <w:proofErr w:type="gramEnd"/>
+      <w:r>
+        <w:t xml:space="preserve"> to ~/STMng):</w:t>
       </w:r>
     </w:p>
     <w:p>
@@ -195,8 +328,23 @@
           <w:numId w:val="2"/>
         </w:numPr>
       </w:pPr>
-      <w:r>
-        <w:t>kplot.linux and ffmpeg go under public/bin</w:t>
+      <w:proofErr w:type="spellStart"/>
+      <w:proofErr w:type="gramStart"/>
+      <w:r>
+        <w:t>kplot.linux</w:t>
+      </w:r>
+      <w:proofErr w:type="spellEnd"/>
+      <w:proofErr w:type="gramEnd"/>
+      <w:r>
+        <w:t xml:space="preserve"> and </w:t>
+      </w:r>
+      <w:proofErr w:type="spellStart"/>
+      <w:r>
+        <w:t>ffmpeg</w:t>
+      </w:r>
+      <w:proofErr w:type="spellEnd"/>
+      <w:r>
+        <w:t xml:space="preserve"> go under public/bin</w:t>
       </w:r>
     </w:p>
     <w:p>
@@ -207,15 +355,156 @@
           <w:numId w:val="2"/>
         </w:numPr>
       </w:pPr>
-      <w:r>
-        <w:t>CaptureMedia.ts and FindSymmetries update the ones under src/electron/modules</w:t>
-      </w:r>
-    </w:p>
-    <w:p>
+      <w:proofErr w:type="spellStart"/>
+      <w:r>
+        <w:t>CaptureMedia.ts</w:t>
+      </w:r>
+      <w:proofErr w:type="spellEnd"/>
+      <w:r>
+        <w:t xml:space="preserve"> and </w:t>
+      </w:r>
+      <w:proofErr w:type="spellStart"/>
+      <w:r>
+        <w:t>FindSymmetries</w:t>
+      </w:r>
+      <w:proofErr w:type="spellEnd"/>
+      <w:r>
+        <w:t xml:space="preserve"> update the ones under </w:t>
+      </w:r>
+      <w:proofErr w:type="spellStart"/>
+      <w:r>
+        <w:t>src</w:t>
+      </w:r>
+      <w:proofErr w:type="spellEnd"/>
+      <w:r>
+        <w:t>/electron/</w:t>
+      </w:r>
+      <w:proofErr w:type="gramStart"/>
+      <w:r>
+        <w:t>modules</w:t>
+      </w:r>
+      <w:proofErr w:type="gramEnd"/>
+    </w:p>
+    <w:p>
+      <w:pPr>
+        <w:pBdr>
+          <w:bottom w:val="single" w:sz="6" w:space="1" w:color="auto"/>
+        </w:pBdr>
+      </w:pPr>
       <w:r>
         <w:t>Now Capture and Symmetries (part find symmetries) modules should work on Linux.</w:t>
       </w:r>
     </w:p>
+    <w:p>
+      <w:r>
+        <w:t xml:space="preserve">After updating the sources with the new files </w:t>
+      </w:r>
+      <w:proofErr w:type="spellStart"/>
+      <w:r>
+        <w:t>npm</w:t>
+      </w:r>
+      <w:proofErr w:type="spellEnd"/>
+      <w:r>
+        <w:t xml:space="preserve"> install should succeed.</w:t>
+      </w:r>
+    </w:p>
+    <w:p>
+      <w:r>
+        <w:t xml:space="preserve">Trying </w:t>
+      </w:r>
+      <w:proofErr w:type="spellStart"/>
+      <w:r>
+        <w:t>npx</w:t>
+      </w:r>
+      <w:proofErr w:type="spellEnd"/>
+      <w:r>
+        <w:t xml:space="preserve"> </w:t>
+      </w:r>
+      <w:proofErr w:type="spellStart"/>
+      <w:r>
+        <w:t>vite</w:t>
+      </w:r>
+      <w:proofErr w:type="spellEnd"/>
+      <w:r>
+        <w:t xml:space="preserve"> gives error for missing libraries. For me:</w:t>
+      </w:r>
+    </w:p>
+    <w:p>
+      <w:r>
+        <w:t>libnss3.so (libnss3)</w:t>
+      </w:r>
+    </w:p>
+    <w:p>
+      <w:r>
+        <w:t>libatk-1.0.so.0 (libatk1.0-0)</w:t>
+      </w:r>
+    </w:p>
+    <w:p>
+      <w:r>
+        <w:t>libatk-bridge-2.0.so.0 (libatk-bridge2.0-0)</w:t>
+      </w:r>
+    </w:p>
+    <w:p>
+      <w:r>
+        <w:t>libcups.so.2 (libcups2)</w:t>
+      </w:r>
+    </w:p>
+    <w:p>
+      <w:r>
+        <w:lastRenderedPageBreak/>
+        <w:t>libgtk-3.so.0 (libgtk-3-0)</w:t>
+      </w:r>
+    </w:p>
+    <w:p>
+      <w:r>
+        <w:t>libgbm.so.1 (libgbm1)</w:t>
+      </w:r>
+    </w:p>
+    <w:p>
+      <w:r>
+        <w:t>libasound.so.2 (libasound2)</w:t>
+      </w:r>
+    </w:p>
+    <w:p>
+      <w:pPr>
+        <w:pBdr>
+          <w:bottom w:val="single" w:sz="6" w:space="1" w:color="auto"/>
+        </w:pBdr>
+      </w:pPr>
+      <w:r>
+        <w:t>The packages to install are in parenthesis.</w:t>
+      </w:r>
+    </w:p>
+    <w:p>
+      <w:r>
+        <w:t xml:space="preserve">To build the application for production, do </w:t>
+      </w:r>
+      <w:proofErr w:type="spellStart"/>
+      <w:r>
+        <w:t>npm</w:t>
+      </w:r>
+      <w:proofErr w:type="spellEnd"/>
+      <w:r>
+        <w:t xml:space="preserve"> run -s build.</w:t>
+      </w:r>
+    </w:p>
+    <w:p>
+      <w:r>
+        <w:t xml:space="preserve">Now under release/0.15.8 you will find the file </w:t>
+      </w:r>
+      <w:r>
+        <w:t>STMng-0.15.</w:t>
+      </w:r>
+      <w:proofErr w:type="gramStart"/>
+      <w:r>
+        <w:t>8.AppImage</w:t>
+      </w:r>
+      <w:proofErr w:type="gramEnd"/>
+      <w:r>
+        <w:t xml:space="preserve"> to run it install the package fuse.</w:t>
+      </w:r>
+    </w:p>
+    <w:p/>
     <w:sectPr>
       <w:pgSz w:w="12240" w:h="15840"/>
       <w:pgMar w:top="1440" w:right="1440" w:bottom="1440" w:left="1440" w:header="708" w:footer="708" w:gutter="0"/>
@@ -1378,6 +1667,18 @@
       <w:shd w:val="clear" w:color="auto" w:fill="E1DFDD"/>
     </w:rPr>
   </w:style>
+  <w:style w:type="character" w:styleId="FollowedHyperlink">
+    <w:name w:val="FollowedHyperlink"/>
+    <w:basedOn w:val="DefaultParagraphFont"/>
+    <w:uiPriority w:val="99"/>
+    <w:semiHidden/>
+    <w:unhideWhenUsed/>
+    <w:rsid w:val="0039360B"/>
+    <w:rPr>
+      <w:color w:val="96607D" w:themeColor="followedHyperlink"/>
+      <w:u w:val="single"/>
+    </w:rPr>
+  </w:style>
 </w:styles>
 </file>
 

</xml_diff>